<commit_message>
fix(ocr): fix layout, captions, OCR structure, image bounds and repeats found in review
</commit_message>
<xml_diff>
--- a/packs/gents/ocr/plugins/ocr/tests/fixtures/report.docx
+++ b/packs/gents/ocr/plugins/ocr/tests/fixtures/report.docx
@@ -2,6 +2,14 @@
 <file path=word/document.xml><?xml version="1.0" encoding="utf-8"?>
 <w:document xmlns:w="http://schemas.openxmlformats.org/wordprocessingml/2006/main" xmlns:r="http://schemas.openxmlformats.org/officeDocument/2006/relationships" xmlns:wp="http://schemas.openxmlformats.org/drawingml/2006/wordprocessingDrawing" xmlns:a="http://schemas.openxmlformats.org/drawingml/2006/main">
   <w:body>
+    <w:p>
+      <w:pPr>
+        <w:pStyle w:val="Title"/>
+      </w:pPr>
+      <w:r>
+        <w:t>Plan Report</w:t>
+      </w:r>
+    </w:p>
     <w:p>
       <w:pPr>
         <w:pStyle w:val="Heading1"/>
@@ -119,6 +127,14 @@
         </w:drawing>
       </w:r>
     </w:p>
+    <w:p>
+      <w:pPr>
+        <w:pStyle w:val="Caption"/>
+      </w:pPr>
+      <w:r>
+        <w:t>Figure 1 - Revenue by region</w:t>
+      </w:r>
+    </w:p>
   </w:body>
 </w:document>
 </file>
@@ -138,8 +154,14 @@
 
 <file path=word/styles.xml><?xml version="1.0" encoding="utf-8"?>
 <w:styles xmlns:w="http://schemas.openxmlformats.org/wordprocessingml/2006/main" xmlns:r="http://schemas.openxmlformats.org/officeDocument/2006/relationships" xmlns:wp="http://schemas.openxmlformats.org/drawingml/2006/wordprocessingDrawing" xmlns:a="http://schemas.openxmlformats.org/drawingml/2006/main">
+  <w:style w:type="paragraph" w:styleId="Title">
+    <w:name w:val="Title"/>
+  </w:style>
   <w:style w:type="paragraph" w:styleId="Heading1">
     <w:name w:val="heading 1"/>
   </w:style>
+  <w:style w:type="paragraph" w:styleId="Caption">
+    <w:name w:val="caption"/>
+  </w:style>
 </w:styles>
 </file>
</xml_diff>